<commit_message>
Complete public-health extension submission revision
</commit_message>
<xml_diff>
--- a/manuscript/FMG_manuscript_final_release_2026-10-25.docx
+++ b/manuscript/FMG_manuscript_final_release_2026-10-25.docx
@@ -43,7 +43,7 @@
         </w:rPr>
       </w:pPr>
       <w:r>
-        <w:t>Incomplete test features can reduce recall for a prespecified group more than aggregate accuracy, leaving a headline score incomplete. We define the Focus-Group Masking Gap (FMG) as the signed difference between focus-group recall loss and aggregate-accuracy loss for the same frozen classifier under test-only feature masking. In the primary benchmark, ten repeated splits across three datasets and four models produced mean FMG above the study-specific descriptive reference of 0.01 in nine of 12 dataset-model comparisons at 20% MCAR. FMG is not a between-group disparity: g0 recall loss exceeded g1 in only 4/12 primary dataset-model pairs. A separate public-health extension evaluated CDC 2024 BRFSS and UCI Diabetes 130-US Hospitals data with five models, three seeds, two split settings, and three controlled masking mechanisms. At 80/20 and 20% MCAR, mean FMG ranged from 0.0272 to 0.0455 across models in BRFSS, but from 0.0000 to 0.0038 in UCI; all BRFSS seed means were positive, while none of the UCI seed means exceeded 0.01. BRFSS evaluation used survey weights and UCI splits were patient-disjoint. These results show dataset-dependent benchmark behavior, not population-level or deployment effects. FMG is a conditional diagnostic, not a fairness certificate, causal estimate, or evidence of operational utility.</w:t>
+        <w:t>Test-time feature missingness can reduce recall in a prespecified group while leaving aggregate accuracy less affected. We define the Focus-Group Masking Gap (FMG) as the signed difference between focus-group recall loss and aggregate-accuracy loss for the same frozen classifier under test-only feature masking. The primary benchmark used ten repeated splits across three datasets and four models; at 20% MCAR, nine of twelve dataset-model means exceeded the study-specific descriptive reference of 0.01. FMG is not a between-group disparity: focus-group recall loss exceeded comparison-group loss in only 4/12 pairs. A separate public-health extension evaluated 2024 BRFSS and UCI Diabetes 130-US Hospitals with five models, three seeds, two split settings, and three controlled missingness mechanisms. At 80/20 and 20% MCAR, BRFSS mean FMG ranged from 0.0272 to 0.0455; comparison-group loss exceeded focus-group loss in all five models. UCI mean FMG ranged from 0.0000 to 0.0038, with mean clean focus recall of 0.000–0.020 across models, indicating a floor effect. BRFSS held-out evaluation used survey weights; UCI splits were patient-disjoint. Findings are descriptive and conditional on the tested benchmarks, groups, and mechanisms. FMG is a diagnostic, not a fairness certificate, causal estimate, or evidence of deployment utility.</w:t>
       </w:r>
     </w:p>
     <w:p>
@@ -2066,7 +2066,7 @@
     </w:p>
     <w:p>
       <w:r>
-        <w:t>Table 3 reports both focus-group and comparison-group positive-class recall losses, plus their signed difference (g0 minus g1). Its percentile-bootstrap 95% intervals for mean FMG and focus-group positive-label denominator ranges are descriptive summaries of repeated-split resampling only; because splits reuse observations from the same finite datasets, they are not independent-population or deployment-level uncertainty intervals. The public-health archive separately reports unit-level bootstrap intervals resampling BRFSS primary sampling units within strata and UCI patients; those intervals are conditional on the specified split, fitted model, and mask replicate.</w:t>
+        <w:t>Table 3 reports both focus-group and comparison-group positive-class recall losses, plus their signed difference (g0 minus g1). Its percentile-bootstrap 95% intervals for mean FMG and focus-group positive-label denominator ranges are descriptive summaries of repeated-split resampling only; because splits reuse observations from the same finite datasets, they are not independent-population or deployment-level uncertainty intervals. The public-health archive separately reports unit-level bootstrap intervals resampling BRFSS primary sampling units within strata and UCI patients; those intervals are conditional on the specified split, fitted model, and mask replicate. The archived primary CSV also includes logistic-regression (LR) rows, which are reported separately from the four-model Table 3 comparison; Adult Income LR mean FMG at 20% MCAR was 0.0191.</w:t>
       </w:r>
     </w:p>
     <w:p>
@@ -2075,7 +2075,7 @@
         <w:spacing w:after="60"/>
       </w:pPr>
       <w:r>
-        <w:t>Reproducibility and correction trace. The canonical corrected notebook, FMG_research_final_REVIEWER_FIXED.ipynb, was rerun end-to-end in a CPU-based Colab runtime. The run manifest records Python 3.13.16 on Linux x86_64, two logical CPUs, and 2,032.9 seconds from primary-run start; it does not record the CPU model or memory allocation. The run produced 800 raw result rows across four datasets (German Credit exploratory), five classifiers, ten seeds, and clean, 5%, 10%, and 20% conditions. Adult adult.data contained 32,561 source rows; 2,399 rows with '?' were excluded under the complete-case rule, leaving 30,162 analyzed records. All ten CSV outputs in the run archive match the manifest's SHA-256 hashes and byte counts. Recalculation from the raw rows reproduces the twelve primary 20%-MCAR dataset-model means, standard deviations, positive-seed counts, and component losses reported in Table 3 at displayed precision; nine means exceed the study-specific descriptive reference of 0.01. The notebook's cell 33 separately regenerated the descriptive bootstrap intervals from the primary seed-level FMG values; the saved intervals match Table 3 at displayed precision. That interval CSV is separate from the ten-file full-run archive. Per-seed denominators, threshold-discordance summaries, and Adult-dependent sensitivities are retained as separate reproducibility outputs. The archive's figures are listed by hash in its manifest; the historical primary Colab run remains distinct, and its backend CPU model and resource allocation are unknown. Results should be reproduced with the documented preprocessing, software versions, and execution settings; variation across other versions or hardware has not been quantified in this study.</w:t>
+        <w:t>Reproducibility and correction trace. The canonical corrected notebook, FMG_research_final_REVIEWER_FIXED.ipynb, was rerun end-to-end in a CPU-based Colab runtime. The run manifest records Python 3.13.16 on Linux x86_64, two logical CPUs, and 2,032.9 seconds from primary-run start; it does not record the CPU model or memory allocation. The run produced 800 raw result rows across four datasets (German Credit exploratory), five classifiers, ten seeds, and clean, 5%, 10%, and 20% conditions. Adult adult.data contained 32,561 source rows; 2,399 rows with '?' were excluded under the complete-case rule, leaving 30,162 analyzed records. All ten CSV outputs in the run archive match the manifest's SHA-256 hashes and byte counts. Recalculation from the raw rows reproduces the twelve primary 20%-MCAR dataset-model means, standard deviations, positive-seed counts, and component losses reported in Table 3 at displayed precision; nine means exceed the study-specific descriptive reference of 0.01. The notebook's cell 33 separately regenerated the descriptive bootstrap intervals from the primary seed-level FMG values; the saved intervals match Table 3 at displayed precision. That interval CSV is separate from the ten-file full-run archive. Per-seed denominators, threshold-discordance summaries, and Adult-dependent sensitivities are retained as separate reproducibility outputs. The archive's figures are listed by hash in its manifest; the historical primary Colab run remains distinct, and its backend CPU model and resource allocation are unknown. Results should be reproduced with the documented preprocessing, software versions, and execution settings. The observed Adult KNN/mode difference across scikit-learn 1.6.1 and 1.9.1 is reported in Section 4.8; this comparison does not isolate a software-version effect, and hardware effects were not separately measured.</w:t>
       </w:r>
     </w:p>
     <w:p>
@@ -3903,7 +3903,7 @@
     <w:p>
       <w:pPr/>
       <w:r>
-        <w:t xml:space="preserve"> A separate multi-model/multi-seed sensitivity re-fit RF, XGBoost, and LightGBM on the two public-health datasets for three seeds, using up to 20 matched test observations per group. The top-ranked mean absolute attribution shifts were the BRFSS age-group feature across all model/group combinations and number_inpatient across the UCI Diabetes combinations (Table S10). For these top features, signed direction agreed with the three-seed mean in two or three seeds, depending on the model and group. These are exploratory attribution shifts, not causal drivers of FMG; raw magnitudes are not compared across models because model output scales and explanation modes differ. The re-fit also used locally recorded software versions that differ from the earlier Colab extension, so it is a separate sensitivity rather than an explanation of the exact earlier fitted objects.</w:t>
+        <w:t xml:space="preserve"> A separate multi-model/multi-seed sensitivity re-fit RF, XGBoost, and LightGBM on the two public-health datasets for three seeds, using up to 20 matched test observations per group. The top-ranked mean absolute attribution shifts were the BRFSS age-group feature across all model/group combinations and number_inpatient across the UCI Diabetes combinations (Table S10). For these top features, signed direction agreed with the three-seed mean in two or three seeds, depending on the model and group. These are exploratory attribution shifts, not causal drivers of FMG; raw magnitudes are not compared across models because model output scales and explanation modes differ. The re-fit also used locally recorded software versions that differ from the earlier Colab extension, so it is a separate sensitivity rather than an explanation of the exact earlier fitted objects. A larger attribution shift for AGEG5YR or number_inpatient reflects a change in the model's attribution to that feature in this sampled comparison; it does not diagnose FMG or explain its value.</w:t>
       </w:r>
     </w:p>
     <w:p>
@@ -5207,15 +5207,12 @@
         <w:pStyle w:val="BodyText"/>
       </w:pPr>
       <w:r>
-        <w:t>The separate extension used 80/20 and 70/30 split settings, three seeds (42, 123, 456), five classifiers, MCAR, one constructed group-conditional MAR mechanism, and one constructed value-conditional MNAR mechanism at 5%, 10%, and 20% masking, with five mask repetitions per condition. Table S7 reports the 20% MCAR results for the 80/20 setting. Each dataset-model mean and standard deviation summarize 15 seed-by-mask-repetition records and are descriptive, not inferential. For BRFSS, mean FMG ranged from 0.0272 to 0.0455 across the five models; the three within-seed averages were positive and exceeded the unvalidated 0.01 descriptive reference for every model. For UCI Diabetes, mean FMG ranged from 0.0000 to 0.0038, and no within-seed average exceeded 0.01. In BRFSS, mean focus-group recall loss was 0.0293 to 0.0467 while mean aggregate-accuracy loss was 0.0013 to 0.0023. In UCI, both losses were close to zero under this condition. The contrast across these two tasks cautions against treating the primary benchmark pattern as universal. The extension broadens the tested settings but does not establish a clinical prediction benefit, causal effect, or deployment utility.</w:t>
-      </w:r>
-      <w:r>
-        <w:t xml:space="preserve"> The added public datasets broaden retrospective benchmark coverage; they do not constitute independent external validation of an operational system.</w:t>
-      </w:r>
-    </w:p>
-    <w:p>
-      <w:r>
-        <w:t>Secondary outcomes and intersectional groups were also available in the completed public-health extension (Supplementary Tables S8–S9). Under 80/20, 20% MCAR, mean masked focus-group precision across the five models ranged from 0.6038 to 0.6696 in BRFSS and 0.0000 to 0.5085 in UCI; corresponding F1 ranges were 0.0994–0.1330 and 0.0000–0.0305, balanced-accuracy ranges were 0.5234–0.5320 and 0.5000–0.5068, and AUROC ranges were 0.7815–0.7906 and 0.6376–0.6456. These are descriptive values averaged over 15 seed-by-mask records per model and show that task and outcome prevalence matter; they do not replace or redefine the primary FMG estimand. In the prespecified intersectional analysis (Black women versus White women in BRFSS; African-American versus other reported-race women in UCI), each model had 15 eligible seed-by-mask records at this condition. For this sensitivity, the contrast uses intersection-specific recall loss and accuracy loss within that intersection, so its accuracy comparator differs from the primary global-accuracy comparator. Mean intersectional FMG ranged from 0.0309 to 0.0461 in BRFSS and 0.0000 to 0.0038 in UCI. The observed positive-record counts varied by model in UCI (0–14 of 15), while all 15 records were positive for every BRFSS model. All included intersectional evaluations met the minimum outcome-cell count rule, but these summaries remain conditional on these two group definitions and three seeds.</w:t>
+        <w:t>The separate extension used 80/20 and 70/30 split settings, three seeds (42, 123, 456), five classifiers, MCAR, one constructed group-conditional MAR mechanism, and one constructed value-conditional MNAR mechanism at 5%, 10%, and 20% masking, with five mask repetitions per condition. Table S7 reports the 80/20, 20% MCAR condition; means and standard deviations summarize 15 seed-by-mask-repetition records per dataset-model and are descriptive. BRFSS mean FMG ranged from 0.0272 to 0.0455; comparison-group (g1) recall loss exceeded focus-group (g0) recall loss for all five models. This can coexist with positive FMG because FMG compares g0 recall loss with aggregate-accuracy loss, not with g1 recall loss. In UCI Diabetes, mean clean focus-group recall ranged from 0.000 to 0.020 across models, and RF clean recall was zero in both groups. The near-zero UCI FMG values therefore reflect a recall-floor limitation in this condition, not evidence of robustness. The extension broadens retrospective benchmark coverage but does not establish clinical benefit, causal effects, or deployment utility, and is not independent external validation of an operational system.</w:t>
+      </w:r>
+    </w:p>
+    <w:p>
+      <w:r>
+        <w:t>Secondary outcomes and intersectional groups were also available in the completed public-health extension (Supplementary Tables S8–S9). Under 80/20, 20% MCAR, mean masked focus-group precision across the five models ranged from 0.6038 to 0.6696 in BRFSS and 0.0000 to 0.5085 in UCI; corresponding F1 ranges were 0.0994–0.1330 and 0.0000–0.0305, balanced-accuracy ranges were 0.5234–0.5320 and 0.5000–0.5068, and AUROC ranges were 0.7815–0.7906 and 0.6376–0.6456. These are descriptive values averaged over 15 seed-by-mask records per model and provide complementary context; they do not replace or redefine the primary FMG estimand. The contrast between tasks cannot isolate the effects of prevalence, outcome definition, cohort composition, model operating point, or evaluation design. In the prespecified intersectional analysis (Black women versus White women in BRFSS; African-American versus other reported-race women in UCI), each model had 15 eligible seed-by-mask records at this condition. For this sensitivity, the contrast uses intersection-specific recall loss and accuracy loss within that intersection, so its accuracy comparator differs from the primary global-accuracy comparator. Mean intersectional FMG ranged from 0.0309 to 0.0461 in BRFSS and 0.0000 to 0.0038 in UCI. The observed positive-record counts varied by model in UCI (0–14 of 15), while all 15 records were positive for every BRFSS model. All included intersectional evaluations met the minimum outcome-cell count rule, but these summaries remain conditional on these two group definitions and three seeds.</w:t>
       </w:r>
     </w:p>
     <w:p>
@@ -5310,7 +5307,7 @@
         <w:pStyle w:val="BodyText"/>
       </w:pPr>
       <w:r>
-        <w:t>The public-health extension reinforces this condition-specific interpretation: FMG exceeded 0.01 in the BRFSS focus-group comparisons but remained below 0.01 in the UCI Diabetes comparisons at the reported 20% MCAR condition. These are distinct retrospective tasks, cohorts, group definitions, and evaluation designs, so the difference is not evidence that one dataset is intrinsically more vulnerable. BRFSS training was unweighted even though held-out metrics used survey weights; this design choice and the three-seed scope should be considered when interpreting the extension.</w:t>
+        <w:t>The public-health extension provides a specific contrast. In BRFSS, comparison-group (g1) recall loss exceeded focus-group (g0) recall loss in all five models, even though the FMG means were positive; FMG compares g0 recall loss with aggregate-accuracy loss, not g1 loss. In UCI Diabetes, clean focus-group recall averaged 0.000–0.020 across models, and RF had zero clean recall in both groups, so its near-zero FMG is a floor-effect observation, not evidence of robust predictions. The datasets differ in task, cohort, group definitions, and evaluation design, and the extension uses only three seeds; these results do not identify which difference accounts for the contrast or establish that one dataset is intrinsically more vulnerable. BRFSS model fitting was unweighted although held-out metrics used survey weights.</w:t>
       </w:r>
     </w:p>
     <w:p>
@@ -5451,7 +5448,8 @@
         <w:spacing w:after="60"/>
       </w:pPr>
       <w:r>
-        <w:t>Data and code availability: The benchmark datasets are publicly available from the sources cited in this manuscript. The public repository contains the study code and earlier archived outputs. The corrected primary notebook and full-run output archive with its manifest are available from the corresponding author on request; the updated run archive is not yet part of the linked public release. The separate public-health extension script, protocol, output archive, and run manifest are maintained with the project materials; raw BRFSS and UCI source data are not redistributed and should be obtained from their providers.</w:t>
+        <w:rPr/>
+        <w:t>Declaration of Generative AI and AI-Assisted Technologies: During the preparation of this manuscript, generative AI tools, including OpenAI’s Prism, were used to assist with language refinement, structural editing, and improvement of clarity and presentation. The authors reviewed and verified the manuscript content, citations, interpretations, and final text and take full responsibility for the accuracy and integrity of the submitted work.</w:t>
       </w:r>
     </w:p>
     <w:p>
@@ -5460,8 +5458,7 @@
         <w:spacing w:after="60"/>
       </w:pPr>
       <w:r>
-        <w:rPr/>
-        <w:t>Declaration of Generative AI and AI-Assisted Technologies: During the preparation of this manuscript, generative AI tools, including OpenAI’s Prism, were used to assist with language refinement, structural editing, and improvement of clarity and presentation. The authors reviewed and verified the manuscript content, citations, interpretations, and final text and take full responsibility for the accuracy and integrity of the submitted work.</w:t>
+        <w:t>Author contributions: M. Vamsi Krishna: conceptualisation, methodology, software, data curation, formal analysis, experiments, and original draft preparation. S. Sri Harsha: validation, investigation, review and editing, and visualisation.</w:t>
       </w:r>
     </w:p>
     <w:p>
@@ -5470,16 +5467,7 @@
         <w:spacing w:after="60"/>
       </w:pPr>
       <w:r>
-        <w:t>Author contributions: M. Vamsi Krishna: conceptualisation, methodology, software, data curation, formal analysis, experiments, and original draft preparation. S. Sri Harsha: validation, investigation, review and editing, and visualisation.</w:t>
-      </w:r>
-    </w:p>
-    <w:p>
-      <w:pPr>
-        <w:pStyle w:val="BodyText"/>
-        <w:spacing w:after="60"/>
-      </w:pPr>
-      <w:r>
-        <w:t>Data Availability: The benchmark datasets are publicly available from the cited providers. The project repository at https://github.com/MVamsiKrishna2501050195/FMG-research/tree/fmg-final-release-2026-10-25 provides the canonical corrected analysis notebook (FMG_research_final_REVIEWER_FIXED.ipynb), the run manifest (run_manifest_20261025.json), and the full corrected-run output archive (reproducibility/FMG_full_run_outputs_2026-10-25.zip), which contains the corrected CSV outputs. The corrected Adult analysis uses only the adult.data training member; adult.test was not appended. The separate public-health extension does not redistribute raw BRFSS or UCI source data.</w:t>
+        <w:t>Data Availability: The benchmark datasets are publicly available from the cited providers. The project repository release at https://github.com/MVamsiKrishna2501050195/FMG-research/tree/fmg-submission-release-v2-2026-10-25 provides the canonical corrected analysis notebook (FMG_research_final_REVIEWER_FIXED.ipynb), run manifest (run_manifest_20261025.json), and full corrected-run output archive (reproducibility/FMG_full_run_outputs_2026-10-25.zip). The release also contains experiments/public_health/ with the extension protocol and code, full-run output archive and manifest, and separate exploratory multi-seed SHAP outputs. Raw BRFSS and UCI source data are not redistributed and should be obtained from their providers. The corrected Adult analysis uses only the adult.data training member; adult.test was not appended.</w:t>
       </w:r>
     </w:p>
     <w:p>

</xml_diff>